<commit_message>
Experience matches the new CV; two CV downloads (full-stack/AI and real-time/backend)
</commit_message>
<xml_diff>
--- a/public/downloads/Boutros_Tawaifi_CV.docx
+++ b/public/downloads/Boutros_Tawaifi_CV.docx
@@ -103,7 +103,7 @@
         <w:spacing w:after="40"/>
       </w:pPr>
       <w:r>
-        <w:t>Senior Full-Stack Engineer with 5 years building and running a live, real-time sports-data platform: 50K+ matches reported across 70+ countries, with customer feeds over WebSocket, RabbitMQ and REST.</w:t>
+        <w:t>Senior Full-Stack Engineer with 5 years as the sole developer of a live, real-time sports-data platform: took a proof-of-concept MVP to production, now covering 50K+ matches across 70+ countries with customer feeds over WebSocket, RabbitMQ and REST.</w:t>
       </w:r>
     </w:p>
     <w:p>
@@ -111,7 +111,7 @@
         <w:spacing w:after="40"/>
       </w:pPr>
       <w:r>
-        <w:t>TypeScript, Node.js, React, Angular, PostgreSQL and AWS. AI-native: builds with coding agents (Claude Code, Codex) daily.</w:t>
+        <w:t>TypeScript, Node.js, React, Angular, PostgreSQL and AWS. AI-native since 2023: ships through a reviewed multi-agent workflow (Claude Code, Codex). Language-agnostic; flexible hours across time zones.</w:t>
       </w:r>
     </w:p>
     <w:p>
@@ -136,7 +136,7 @@
         <w:spacing w:after="40"/>
       </w:pPr>
       <w:r>
-        <w:t>Languages: TypeScript, JavaScript, Python, Go, SQL</w:t>
+        <w:t>Languages: TypeScript, JavaScript, Python, Go, Rust, SQL</w:t>
       </w:r>
     </w:p>
     <w:p>
@@ -188,7 +188,7 @@
         <w:spacing w:after="40"/>
       </w:pPr>
       <w:r>
-        <w:t>Testing &amp; Quality: Jest, Vitest, SonarQube, Semgrep</w:t>
+        <w:t>Testing &amp; Quality: Jest, Vitest, SonarQube, Semgrep, mutation and fuzz testing</w:t>
       </w:r>
     </w:p>
     <w:p>
@@ -228,7 +228,7 @@
         <w:rPr>
           <w:i/>
         </w:rPr>
-        <w:t>B2B live sports data: 1,000+ active analysts report match events in real time, from the stadium, from TV broadcasts or by phone, and customers receive them as data feeds. Sole engineer, working directly with the founders.</w:t>
+        <w:t>B2B live sports data: 1,000+ active analysts report match events in real time, from the stadium, from TV broadcasts or by phone, and customers receive them as data feeds. Sole developer, working directly with the four founders, who each own a different area.</w:t>
       </w:r>
     </w:p>
     <w:p>
@@ -237,7 +237,7 @@
         <w:ind w:left="187" w:hanging="187"/>
       </w:pPr>
       <w:r>
-        <w:t>• Took over a small inherited system in 2021 and grew it into a platform covering 20–50 live matches a day.</w:t>
+        <w:t>• Took over a proof-of-concept MVP (a backend plus admin and reporter app shells, built to test market interest) and rebuilt it into a production platform: rewrote the backend and both apps, built the infrastructure, email system and deployments, and connected it all. It now covers 20–50 live matches on a typical day.</w:t>
       </w:r>
     </w:p>
     <w:p>
@@ -264,7 +264,7 @@
         <w:ind w:left="187" w:hanging="187"/>
       </w:pPr>
       <w:r>
-        <w:t>• Built a Go scheduler and Node.js workers (Chrome DevTools Protocol) that track market odds for up to 300 matches at once into TimescaleDB and Redis, used to verify reporter events in real time.</w:t>
+        <w:t>• Built a Go scheduler and Node.js workers (Chrome DevTools Protocol) that observe a public third-party source for up to 300 matches at once into TimescaleDB and Redis, used internally for quality and divergence checks against reporter events.</w:t>
       </w:r>
     </w:p>
     <w:p>
@@ -273,16 +273,7 @@
         <w:ind w:left="187" w:hanging="187"/>
       </w:pPr>
       <w:r>
-        <w:t>• Extended the React reporter apps (lineups, substitutions, penalty shootouts, basketball quarters) and the Angular admin's moderator tools: locking reporter actions, tagging stadium or TV coverage, per-customer data delays.</w:t>
-      </w:r>
-    </w:p>
-    <w:p>
-      <w:pPr>
-        <w:spacing w:after="40"/>
-        <w:ind w:left="187" w:hanging="187"/>
-      </w:pPr>
-      <w:r>
-        <w:t>• Built trial accounts limited by region and competition, and a new customer dashboard, so prospects can try the data before buying.</w:t>
+        <w:t>• Extended the React reporter apps (lineups, substitutions, penalty shootouts, basketball quarters) and the Angular admin's moderator tools (locking reporter actions, per-customer data delays); built trial accounts limited by region and competition, and a customer dashboard.</w:t>
       </w:r>
     </w:p>
     <w:p>
@@ -300,7 +291,16 @@
         <w:ind w:left="187" w:hanging="187"/>
       </w:pPr>
       <w:r>
-        <w:t>• Ran production infrastructure on AWS (EC2, Docker, private subnets, Security Groups, IP-allowlisted SSH, secrets in SSM); backend deploys run reviewed database migrations, a PM2 restart and health checks, and the front-end apps deploy with one script each.</w:t>
+        <w:t>• Ran production infrastructure on AWS (EC2, Docker, private subnets, Security Groups, IP-allowlisted SSH, secrets in SSM); backend deploys run reviewed database migrations, a PM2 restart and health checks.</w:t>
+      </w:r>
+    </w:p>
+    <w:p>
+      <w:pPr>
+        <w:spacing w:after="40"/>
+        <w:ind w:left="187" w:hanging="187"/>
+      </w:pPr>
+      <w:r>
+        <w:t>• Fixed outbound email being rejected by Google Workspace with rate-limit errors: traced it in the application logs to a non-obvious mail-library setting that made the server identify itself by its IP instead of the domain.</w:t>
       </w:r>
     </w:p>
     <w:p>
@@ -318,7 +318,19 @@
         <w:ind w:left="187" w:hanging="187"/>
       </w:pPr>
       <w:r>
-        <w:t>• Used coding agents for feature work and test generation on legacy code; reviewed every agent-written change, and replaced LLM-generated test data with deterministic generators.</w:t>
+        <w:t>• Coding with AI since 2023, from manual ChatGPT-assisted work to an agentic workflow (Claude Code, Codex): tasks from Trello are built in slices on separate branches or worktrees, cross-reviewed by a second agent, then checked with unit, integration, mutation and fuzz tests plus visual and divergence checks. I review the agents' work through documents at several levels of detail, as I would another engineer's, and read the code myself before the final review. Deploy access is unlocked only for the release and relocked; the founders sign off each feature.</w:t>
+      </w:r>
+    </w:p>
+    <w:p>
+      <w:pPr>
+        <w:keepNext/>
+        <w:spacing w:after="60" w:before="160"/>
+      </w:pPr>
+      <w:r>
+        <w:rPr>
+          <w:b/>
+        </w:rPr>
+        <w:t>Freelance | Web development and video post-production | 2019 – 2021 (alongside university studies)</w:t>
       </w:r>
     </w:p>
     <w:p>

</xml_diff>

<commit_message>
Experience, Impact, About and CVs: current Orbit wording
Orbit bullets now describe the platform end to end (microservices, security, scripted deploys). Dropped the MVP, founders, 20-50 matches, 300-match and "own measurement" wording, and refreshed the downloadable CVs.

Co-Authored-By: Claude Sonnet 5.5 <noreply@anthropic.com>
</commit_message>
<xml_diff>
--- a/public/downloads/Boutros_Tawaifi_CV.docx
+++ b/public/downloads/Boutros_Tawaifi_CV.docx
@@ -103,7 +103,7 @@
         <w:spacing w:after="40"/>
       </w:pPr>
       <w:r>
-        <w:t>Senior Full-Stack Engineer with 5 years as the sole developer of a live, real-time sports-data platform: took a proof-of-concept MVP to production, now covering 50K+ matches across 70+ countries with customer feeds over WebSocket, RabbitMQ and REST.</w:t>
+        <w:t>Senior Full-Stack Engineer with 5 years building and running a live, real-time sports-data platform, now covering 50K+ matches across 70+ countries with customer feeds over WebSocket, RabbitMQ and REST.</w:t>
       </w:r>
     </w:p>
     <w:p>
@@ -228,7 +228,7 @@
         <w:rPr>
           <w:i/>
         </w:rPr>
-        <w:t>B2B live sports data: 1,000+ active analysts report match events in real time, from the stadium, from TV broadcasts or by phone, and customers receive them as data feeds. Sole developer, working directly with the four founders, who each own a different area.</w:t>
+        <w:t>B2B live sports data: 1,000+ active analysts report match events in real time, from the stadium, from TV broadcasts or by phone, and customers receive them as data feeds. Sole developer of the platform.</w:t>
       </w:r>
     </w:p>
     <w:p>
@@ -237,7 +237,7 @@
         <w:ind w:left="187" w:hanging="187"/>
       </w:pPr>
       <w:r>
-        <w:t>• Took over a proof-of-concept MVP (a backend plus admin and reporter app shells, built to test market interest) and rebuilt it into a production platform: rewrote the backend and both apps, built the infrastructure, email system and deployments, and connected it all. It now covers 20–50 live matches on a typical day.</w:t>
+        <w:t>• Own the platform end to end: a microservices backend (core API, third-party coverage ingestion, Go scheduler, email worker, each deployed on its own), the reporter and admin apps, customer tools, infrastructure and deployments. 50K+ matches across 70+ countries to date.</w:t>
       </w:r>
     </w:p>
     <w:p>
@@ -246,7 +246,7 @@
         <w:ind w:left="187" w:hanging="187"/>
       </w:pPr>
       <w:r>
-        <w:t>• Built third-party coverage ingestion (Extended Live): live match data from several providers, mapped into Orbit's format, de-duplicated and reconciled, with a customer-facing showcase app.</w:t>
+        <w:t>• Built the live event pipeline: transactional writes, idempotent corrections (e.g. cancelled goals), de-duplication and strict event order, delivered per customer over RabbitMQ queues, WebSocket and REST with OpenAPI contracts at 70–150 ms request/response.</w:t>
       </w:r>
     </w:p>
     <w:p>
@@ -255,7 +255,7 @@
         <w:ind w:left="187" w:hanging="187"/>
       </w:pPr>
       <w:r>
-        <w:t>• Built the live event pipeline: de-duplication, reversal handling (e.g. cancelled goals) and strict event order, delivered to customers over WebSocket, RabbitMQ and REST at 70–150 ms request/response (own measurement).</w:t>
+        <w:t>• Built third-party coverage ingestion (Extended Live): live match data from several providers, mapped into Orbit's format, de-duplicated with atomic Redis scripts and reconciled, with a customer-facing showcase app.</w:t>
       </w:r>
     </w:p>
     <w:p>
@@ -264,7 +264,7 @@
         <w:ind w:left="187" w:hanging="187"/>
       </w:pPr>
       <w:r>
-        <w:t>• Built a Go scheduler and Node.js workers (Chrome DevTools Protocol) that observe a public third-party source for up to 300 matches at once into TimescaleDB and Redis, used internally for quality and divergence checks against reporter events.</w:t>
+        <w:t>• Built a Go scheduler and Node.js workers (Chrome DevTools Protocol) that observe a public third-party source into TimescaleDB and Redis, used internally for quality and divergence checks against reporter events.</w:t>
       </w:r>
     </w:p>
     <w:p>
@@ -282,6 +282,15 @@
         <w:ind w:left="187" w:hanging="187"/>
       </w:pPr>
       <w:r>
+        <w:t>• Secured the platform: authentication and access control, Redis-backed rate limiting and security headers.</w:t>
+      </w:r>
+    </w:p>
+    <w:p>
+      <w:pPr>
+        <w:spacing w:after="40"/>
+        <w:ind w:left="187" w:hanging="187"/>
+      </w:pPr>
+      <w:r>
         <w:t>• Added 3,000+ automated tests, SonarQube and Semgrep scans, and replay tools that re-run recorded matches to verify fixes.</w:t>
       </w:r>
     </w:p>
@@ -291,7 +300,7 @@
         <w:ind w:left="187" w:hanging="187"/>
       </w:pPr>
       <w:r>
-        <w:t>• Ran production infrastructure on AWS (EC2, Docker, private subnets, Security Groups, IP-allowlisted SSH, secrets in SSM); backend deploys run reviewed database migrations, a PM2 restart and health checks.</w:t>
+        <w:t>• Ran production on Linux and AWS (EC2, Docker) with scripted per-service deploys: reviewed database migrations, a PM2 restart and health checks.</w:t>
       </w:r>
     </w:p>
     <w:p>
@@ -309,16 +318,7 @@
         <w:ind w:left="187" w:hanging="187"/>
       </w:pPr>
       <w:r>
-        <w:t>• Built browser extensions that match event data between two sources and fill an internal admin form, with JSON export for review.</w:t>
-      </w:r>
-    </w:p>
-    <w:p>
-      <w:pPr>
-        <w:spacing w:after="40"/>
-        <w:ind w:left="187" w:hanging="187"/>
-      </w:pPr>
-      <w:r>
-        <w:t>• Coding with AI since 2023, from manual ChatGPT-assisted work to an agentic workflow (Claude Code, Codex): tasks from Trello are built in slices on separate branches or worktrees, cross-reviewed by a second agent, then checked with unit, integration, mutation and fuzz tests plus visual and divergence checks. I review the agents' work through documents at several levels of detail, as I would another engineer's, and read the code myself before the final review. Deploy access is unlocked only for the release and relocked; the founders sign off each feature.</w:t>
+        <w:t>• Coding with AI since 2023, from manual ChatGPT-assisted work to an agentic workflow (Claude Code, Codex): tasks from Trello are built in slices on separate branches or worktrees, cross-reviewed by a second agent, then checked with unit, integration, mutation and fuzz tests plus visual and divergence checks. I review the agents' work through documents at several levels of detail, as I would another engineer's, and read the code myself before the final review. Deploy access is unlocked only for the release and relocked.</w:t>
       </w:r>
     </w:p>
     <w:p>

</xml_diff>

<commit_message>
Add Jest/Vitest/Supertest, Drizzle ORM and GitHub Actions CI; refresh CVs
Each item is backed by the codebases: Supertest in the Orbit server tests, Drizzle ORM and Vitest in Strategy Asylum, and CI workflows in the MCP bridge repo. CV downloads rebuilt to match.

Co-Authored-By: Claude Sonnet 5.5 <noreply@anthropic.com>
</commit_message>
<xml_diff>
--- a/public/downloads/Boutros_Tawaifi_CV.docx
+++ b/public/downloads/Boutros_Tawaifi_CV.docx
@@ -152,7 +152,7 @@
         <w:spacing w:after="40"/>
       </w:pPr>
       <w:r>
-        <w:t>Backend: Node.js, Express, TypeORM, REST APIs, WebSocket APIs, RabbitMQ (AMQP), OpenAPI, Puppeteer</w:t>
+        <w:t>Backend: Node.js, Express, TypeORM, Drizzle ORM, REST APIs, WebSocket APIs, RabbitMQ (AMQP), OpenAPI, Puppeteer</w:t>
       </w:r>
     </w:p>
     <w:p>
@@ -168,7 +168,7 @@
         <w:spacing w:after="40"/>
       </w:pPr>
       <w:r>
-        <w:t>Cloud &amp; DevOps: AWS (EC2, VPC, Security Groups, SSM Parameter Store), Linux, Docker, PM2, automated deployments</w:t>
+        <w:t>Cloud &amp; DevOps: AWS (EC2, VPC, Security Groups, SSM Parameter Store), Linux, Docker, PM2, CI/CD (GitHub Actions), scripted deployments</w:t>
       </w:r>
     </w:p>
     <w:p>
@@ -188,7 +188,7 @@
         <w:spacing w:after="40"/>
       </w:pPr>
       <w:r>
-        <w:t>Testing &amp; Quality: Jest, Vitest, SonarQube, Semgrep, mutation and fuzz testing</w:t>
+        <w:t>Testing &amp; Quality: Jest, Vitest, Supertest, SonarQube, Semgrep, mutation and fuzz testing</w:t>
       </w:r>
     </w:p>
     <w:p>
@@ -291,7 +291,7 @@
         <w:ind w:left="187" w:hanging="187"/>
       </w:pPr>
       <w:r>
-        <w:t>• Added 3,000+ automated tests, SonarQube and Semgrep scans, and replay tools that re-run recorded matches to verify fixes.</w:t>
+        <w:t>• Added 3,000+ automated tests (Jest, Vitest, Supertest API tests), SonarQube and Semgrep scans, and replay tools that re-run recorded matches to verify fixes.</w:t>
       </w:r>
     </w:p>
     <w:p>
@@ -416,7 +416,7 @@
         </w:r>
       </w:hyperlink>
       <w:r>
-        <w:t xml:space="preserve">, built with AI agents): a Model Context Protocol (MCP) server that gives AI coding tools controlled access to a codebase: search, read, patches with rollback, Git and validation commands, over stdio or OAuth-protected HTTP.</w:t>
+        <w:t xml:space="preserve">, built with AI agents): a Model Context Protocol (MCP) server that gives AI coding tools controlled access to a codebase: search, read, patches with rollback, Git and validation commands, over stdio or OAuth-protected HTTP, with GitHub Actions CI (tests, build, dependency audit).</w:t>
       </w:r>
     </w:p>
     <w:p>
@@ -437,7 +437,7 @@
         </w:r>
       </w:hyperlink>
       <w:r>
-        <w:t xml:space="preserve">, built with AI agents): a Next.js and PostgreSQL web app where an AI co-pilot guides business-strategy frameworks such as SWOT and PESTLE and generates strategy documents.</w:t>
+        <w:t xml:space="preserve">, built with AI agents): a Next.js, Drizzle ORM and PostgreSQL web app, tested with Vitest, where an AI co-pilot guides business-strategy frameworks such as SWOT and PESTLE and generates strategy documents.</w:t>
       </w:r>
     </w:p>
     <w:p>

</xml_diff>

<commit_message>
Correct Docker and database wording on the site and CV downloads
Docker is used for local development, not production, so drop it from the
production bullet and the Orbit and core-stack tags (Cloud & DevOps keeps it
as "Docker (local development)"). Name MySQL, the core database, in the
summaries and tech lists. CV downloads rebuilt with the same three edits;
no figures changed.

Co-Authored-By: Claude Sonnet 5.5 <noreply@anthropic.com>
</commit_message>
<xml_diff>
--- a/public/downloads/Boutros_Tawaifi_CV.docx
+++ b/public/downloads/Boutros_Tawaifi_CV.docx
@@ -111,7 +111,7 @@
         <w:spacing w:after="40"/>
       </w:pPr>
       <w:r>
-        <w:t>TypeScript, Node.js, React, Angular, PostgreSQL and AWS. AI-native since 2023: ships through a reviewed multi-agent workflow (Claude Code, Codex). Language-agnostic; flexible hours across time zones.</w:t>
+        <w:t>TypeScript, Node.js, React, Angular, MySQL, PostgreSQL and AWS. AI-native since 2023: ships through a reviewed multi-agent workflow (Claude Code, Codex). Language-agnostic; flexible hours across time zones.</w:t>
       </w:r>
     </w:p>
     <w:p>
@@ -168,7 +168,7 @@
         <w:spacing w:after="40"/>
       </w:pPr>
       <w:r>
-        <w:t>Cloud &amp; DevOps: AWS (EC2, VPC, Security Groups, SSM Parameter Store), Linux, Docker, PM2, CI/CD (GitHub Actions), scripted deployments</w:t>
+        <w:t>Cloud &amp; DevOps: AWS (EC2, VPC, Security Groups, SSM Parameter Store), Linux, Docker (local development), PM2, CI/CD (GitHub Actions), scripted deployments</w:t>
       </w:r>
     </w:p>
     <w:p>
@@ -300,7 +300,7 @@
         <w:ind w:left="187" w:hanging="187"/>
       </w:pPr>
       <w:r>
-        <w:t>• Ran production on Linux and AWS (EC2, Docker) with scripted per-service deploys: reviewed database migrations, a PM2 restart and health checks.</w:t>
+        <w:t>• Ran production on Linux and AWS (EC2) with scripted per-service deploys: reviewed database migrations, a PM2 restart and health checks.</w:t>
       </w:r>
     </w:p>
     <w:p>

</xml_diff>